<commit_message>
Saya sudah mengerjakan Use Case Diagram
</commit_message>
<xml_diff>
--- a/1_Template Perencanaan Project UKK RPL.docx
+++ b/1_Template Perencanaan Project UKK RPL.docx
@@ -536,6 +536,9 @@
             <w:r>
               <w:t>2026</w:t>
             </w:r>
+            <w:r>
+              <w:t>-2027</w:t>
+            </w:r>
           </w:p>
         </w:tc>
       </w:tr>
@@ -4331,6 +4334,9 @@
             </w:pPr>
             <w:r>
               <w:t>2026</w:t>
+            </w:r>
+            <w:r>
+              <w:t>-2027</w:t>
             </w:r>
           </w:p>
         </w:tc>
@@ -9924,7 +9930,15 @@
             </w:r>
             <w:proofErr w:type="spellEnd"/>
             <w:r>
-              <w:t xml:space="preserve"> lainnya.</w:t>
+              <w:t xml:space="preserve"> </w:t>
+            </w:r>
+            <w:proofErr w:type="spellStart"/>
+            <w:r>
+              <w:t>lainnya</w:t>
+            </w:r>
+            <w:proofErr w:type="spellEnd"/>
+            <w:r>
+              <w:t>.</w:t>
             </w:r>
           </w:p>
         </w:tc>
@@ -10363,6 +10377,9 @@
             <w:pPr>
               <w:spacing w:after="120"/>
             </w:pPr>
+            <w:r>
+              <w:t xml:space="preserve">Admin </w:t>
+            </w:r>
           </w:p>
         </w:tc>
         <w:tc>
@@ -10386,6 +10403,70 @@
             <w:pPr>
               <w:spacing w:after="120"/>
             </w:pPr>
+            <w:proofErr w:type="spellStart"/>
+            <w:r>
+              <w:t>Bertugas</w:t>
+            </w:r>
+            <w:proofErr w:type="spellEnd"/>
+            <w:r>
+              <w:t xml:space="preserve"> </w:t>
+            </w:r>
+            <w:proofErr w:type="spellStart"/>
+            <w:r>
+              <w:t>mengelola</w:t>
+            </w:r>
+            <w:proofErr w:type="spellEnd"/>
+            <w:r>
+              <w:t xml:space="preserve"> data </w:t>
+            </w:r>
+            <w:proofErr w:type="spellStart"/>
+            <w:r>
+              <w:t>produk</w:t>
+            </w:r>
+            <w:proofErr w:type="spellEnd"/>
+            <w:r>
+              <w:t xml:space="preserve">, </w:t>
+            </w:r>
+            <w:proofErr w:type="spellStart"/>
+            <w:r>
+              <w:t>stok</w:t>
+            </w:r>
+            <w:proofErr w:type="spellEnd"/>
+            <w:r>
+              <w:t xml:space="preserve">, </w:t>
+            </w:r>
+            <w:proofErr w:type="spellStart"/>
+            <w:r>
+              <w:t>pelanggan</w:t>
+            </w:r>
+            <w:proofErr w:type="spellEnd"/>
+            <w:r>
+              <w:t xml:space="preserve">, </w:t>
+            </w:r>
+            <w:proofErr w:type="spellStart"/>
+            <w:r>
+              <w:t>pengguna</w:t>
+            </w:r>
+            <w:proofErr w:type="spellEnd"/>
+            <w:r>
+              <w:t xml:space="preserve">, dan </w:t>
+            </w:r>
+            <w:proofErr w:type="spellStart"/>
+            <w:r>
+              <w:t>riwayat</w:t>
+            </w:r>
+            <w:proofErr w:type="spellEnd"/>
+            <w:r>
+              <w:t xml:space="preserve"> </w:t>
+            </w:r>
+            <w:proofErr w:type="spellStart"/>
+            <w:r>
+              <w:t>transaksi</w:t>
+            </w:r>
+            <w:proofErr w:type="spellEnd"/>
+            <w:r>
+              <w:t>.</w:t>
+            </w:r>
           </w:p>
         </w:tc>
       </w:tr>
@@ -10444,6 +10525,11 @@
             <w:pPr>
               <w:spacing w:after="120"/>
             </w:pPr>
+            <w:proofErr w:type="spellStart"/>
+            <w:r>
+              <w:t>Kasir</w:t>
+            </w:r>
+            <w:proofErr w:type="spellEnd"/>
           </w:p>
         </w:tc>
         <w:tc>
@@ -10467,6 +10553,75 @@
             <w:pPr>
               <w:spacing w:after="120"/>
             </w:pPr>
+            <w:proofErr w:type="spellStart"/>
+            <w:r>
+              <w:t>Bertugas</w:t>
+            </w:r>
+            <w:proofErr w:type="spellEnd"/>
+            <w:r>
+              <w:t xml:space="preserve"> </w:t>
+            </w:r>
+            <w:proofErr w:type="spellStart"/>
+            <w:r>
+              <w:t>melakukan</w:t>
+            </w:r>
+            <w:proofErr w:type="spellEnd"/>
+            <w:r>
+              <w:t xml:space="preserve"> </w:t>
+            </w:r>
+            <w:proofErr w:type="spellStart"/>
+            <w:r>
+              <w:t>transaksi</w:t>
+            </w:r>
+            <w:proofErr w:type="spellEnd"/>
+            <w:r>
+              <w:t xml:space="preserve"> </w:t>
+            </w:r>
+            <w:proofErr w:type="spellStart"/>
+            <w:r>
+              <w:t>penjualan</w:t>
+            </w:r>
+            <w:proofErr w:type="spellEnd"/>
+            <w:r>
+              <w:t xml:space="preserve">, </w:t>
+            </w:r>
+            <w:proofErr w:type="spellStart"/>
+            <w:r>
+              <w:t>mengelola</w:t>
+            </w:r>
+            <w:proofErr w:type="spellEnd"/>
+            <w:r>
+              <w:t xml:space="preserve"> data </w:t>
+            </w:r>
+            <w:proofErr w:type="spellStart"/>
+            <w:r>
+              <w:t>pelanggan</w:t>
+            </w:r>
+            <w:proofErr w:type="spellEnd"/>
+            <w:r>
+              <w:t xml:space="preserve">, dan </w:t>
+            </w:r>
+            <w:proofErr w:type="spellStart"/>
+            <w:r>
+              <w:t>melihat</w:t>
+            </w:r>
+            <w:proofErr w:type="spellEnd"/>
+            <w:r>
+              <w:t xml:space="preserve"> </w:t>
+            </w:r>
+            <w:proofErr w:type="spellStart"/>
+            <w:r>
+              <w:t>riwayat</w:t>
+            </w:r>
+            <w:proofErr w:type="spellEnd"/>
+            <w:r>
+              <w:t xml:space="preserve"> </w:t>
+            </w:r>
+            <w:proofErr w:type="spellStart"/>
+            <w:r>
+              <w:t>transaksi</w:t>
+            </w:r>
+            <w:proofErr w:type="spellEnd"/>
           </w:p>
         </w:tc>
       </w:tr>
@@ -10525,6 +10680,11 @@
             <w:pPr>
               <w:spacing w:after="120"/>
             </w:pPr>
+            <w:proofErr w:type="spellStart"/>
+            <w:r>
+              <w:t>Manajer</w:t>
+            </w:r>
+            <w:proofErr w:type="spellEnd"/>
           </w:p>
         </w:tc>
         <w:tc>
@@ -10548,87 +10708,78 @@
             <w:pPr>
               <w:spacing w:after="120"/>
             </w:pPr>
-          </w:p>
-        </w:tc>
-      </w:tr>
-      <w:tr>
-        <w:tblPrEx>
-          <w:tblCellMar>
-            <w:top w:w="0" w:type="dxa"/>
-            <w:bottom w:w="0" w:type="dxa"/>
-          </w:tblCellMar>
-        </w:tblPrEx>
-        <w:tc>
-          <w:tcPr>
-            <w:tcW w:w="700" w:type="dxa"/>
-            <w:tcBorders>
-              <w:top w:val="single" w:sz="4" w:space="0" w:color="000000"/>
-              <w:left w:val="single" w:sz="4" w:space="0" w:color="000000"/>
-              <w:bottom w:val="single" w:sz="4" w:space="0" w:color="000000"/>
-              <w:right w:val="single" w:sz="4" w:space="0" w:color="000000"/>
-            </w:tcBorders>
-            <w:tcMar>
-              <w:top w:w="100" w:type="dxa"/>
-              <w:left w:w="120" w:type="dxa"/>
-              <w:bottom w:w="100" w:type="dxa"/>
-              <w:right w:w="120" w:type="dxa"/>
-            </w:tcMar>
-            <w:vAlign w:val="center"/>
-          </w:tcPr>
-          <w:p>
-            <w:pPr>
-              <w:spacing w:after="120"/>
-              <w:jc w:val="center"/>
-            </w:pPr>
-            <w:r>
-              <w:t>4</w:t>
-            </w:r>
-          </w:p>
-        </w:tc>
-        <w:tc>
-          <w:tcPr>
-            <w:tcW w:w="2500" w:type="dxa"/>
-            <w:tcBorders>
-              <w:top w:val="single" w:sz="4" w:space="0" w:color="000000"/>
-              <w:left w:val="single" w:sz="4" w:space="0" w:color="000000"/>
-              <w:bottom w:val="single" w:sz="4" w:space="0" w:color="000000"/>
-              <w:right w:val="single" w:sz="4" w:space="0" w:color="000000"/>
-            </w:tcBorders>
-            <w:tcMar>
-              <w:top w:w="100" w:type="dxa"/>
-              <w:left w:w="120" w:type="dxa"/>
-              <w:bottom w:w="100" w:type="dxa"/>
-              <w:right w:w="120" w:type="dxa"/>
-            </w:tcMar>
-            <w:vAlign w:val="center"/>
-          </w:tcPr>
-          <w:p>
-            <w:pPr>
-              <w:spacing w:after="120"/>
-            </w:pPr>
-          </w:p>
-        </w:tc>
-        <w:tc>
-          <w:tcPr>
-            <w:tcW w:w="5872" w:type="dxa"/>
-            <w:tcBorders>
-              <w:top w:val="single" w:sz="4" w:space="0" w:color="000000"/>
-              <w:left w:val="single" w:sz="4" w:space="0" w:color="000000"/>
-              <w:bottom w:val="single" w:sz="4" w:space="0" w:color="000000"/>
-              <w:right w:val="single" w:sz="4" w:space="0" w:color="000000"/>
-            </w:tcBorders>
-            <w:tcMar>
-              <w:top w:w="100" w:type="dxa"/>
-              <w:left w:w="120" w:type="dxa"/>
-              <w:bottom w:w="100" w:type="dxa"/>
-              <w:right w:w="120" w:type="dxa"/>
-            </w:tcMar>
-            <w:vAlign w:val="center"/>
-          </w:tcPr>
-          <w:p>
-            <w:pPr>
-              <w:spacing w:after="120"/>
-            </w:pPr>
+            <w:proofErr w:type="spellStart"/>
+            <w:r>
+              <w:t>Bertugas</w:t>
+            </w:r>
+            <w:proofErr w:type="spellEnd"/>
+            <w:r>
+              <w:t xml:space="preserve"> </w:t>
+            </w:r>
+            <w:proofErr w:type="spellStart"/>
+            <w:r>
+              <w:t>memantau</w:t>
+            </w:r>
+            <w:proofErr w:type="spellEnd"/>
+            <w:r>
+              <w:t xml:space="preserve"> data </w:t>
+            </w:r>
+            <w:proofErr w:type="spellStart"/>
+            <w:r>
+              <w:t>penjualan</w:t>
+            </w:r>
+            <w:proofErr w:type="spellEnd"/>
+            <w:r>
+              <w:t xml:space="preserve">, </w:t>
+            </w:r>
+            <w:proofErr w:type="spellStart"/>
+            <w:r>
+              <w:t>stok</w:t>
+            </w:r>
+            <w:proofErr w:type="spellEnd"/>
+            <w:r>
+              <w:t xml:space="preserve">, </w:t>
+            </w:r>
+            <w:proofErr w:type="spellStart"/>
+            <w:r>
+              <w:t>riwayat</w:t>
+            </w:r>
+            <w:proofErr w:type="spellEnd"/>
+            <w:r>
+              <w:t xml:space="preserve"> </w:t>
+            </w:r>
+            <w:proofErr w:type="spellStart"/>
+            <w:r>
+              <w:t>transaksi</w:t>
+            </w:r>
+            <w:proofErr w:type="spellEnd"/>
+            <w:r>
+              <w:t xml:space="preserve"> </w:t>
+            </w:r>
+            <w:proofErr w:type="spellStart"/>
+            <w:r>
+              <w:t>untuk</w:t>
+            </w:r>
+            <w:proofErr w:type="spellEnd"/>
+            <w:r>
+              <w:t xml:space="preserve"> </w:t>
+            </w:r>
+            <w:proofErr w:type="spellStart"/>
+            <w:r>
+              <w:t>kebutuhan</w:t>
+            </w:r>
+            <w:proofErr w:type="spellEnd"/>
+            <w:r>
+              <w:t xml:space="preserve"> </w:t>
+            </w:r>
+            <w:proofErr w:type="spellStart"/>
+            <w:r>
+              <w:t>evaluasi</w:t>
+            </w:r>
+            <w:proofErr w:type="spellEnd"/>
+            <w:r>
+              <w:t>.</w:t>
+            </w:r>
           </w:p>
         </w:tc>
       </w:tr>
@@ -10842,6 +10993,9 @@
             <w:pPr>
               <w:spacing w:after="120"/>
             </w:pPr>
+            <w:r>
+              <w:t>Login</w:t>
+            </w:r>
           </w:p>
         </w:tc>
         <w:tc>
@@ -10865,6 +11019,22 @@
             <w:pPr>
               <w:spacing w:after="120"/>
             </w:pPr>
+            <w:r>
+              <w:t xml:space="preserve">Admin, </w:t>
+            </w:r>
+            <w:proofErr w:type="spellStart"/>
+            <w:r>
+              <w:t>Kasir</w:t>
+            </w:r>
+            <w:proofErr w:type="spellEnd"/>
+            <w:r>
+              <w:t xml:space="preserve">, </w:t>
+            </w:r>
+            <w:proofErr w:type="spellStart"/>
+            <w:r>
+              <w:t>Manajer</w:t>
+            </w:r>
+            <w:proofErr w:type="spellEnd"/>
           </w:p>
         </w:tc>
       </w:tr>
@@ -10923,6 +11093,14 @@
             <w:pPr>
               <w:spacing w:after="120"/>
             </w:pPr>
+            <w:r>
+              <w:t xml:space="preserve">Kelola </w:t>
+            </w:r>
+            <w:proofErr w:type="spellStart"/>
+            <w:r>
+              <w:t>Produk</w:t>
+            </w:r>
+            <w:proofErr w:type="spellEnd"/>
           </w:p>
         </w:tc>
         <w:tc>
@@ -10946,6 +11124,9 @@
             <w:pPr>
               <w:spacing w:after="120"/>
             </w:pPr>
+            <w:r>
+              <w:t>Admin</w:t>
+            </w:r>
           </w:p>
         </w:tc>
       </w:tr>
@@ -11004,6 +11185,14 @@
             <w:pPr>
               <w:spacing w:after="120"/>
             </w:pPr>
+            <w:r>
+              <w:t xml:space="preserve">Kelola </w:t>
+            </w:r>
+            <w:proofErr w:type="spellStart"/>
+            <w:r>
+              <w:t>Pelanggan</w:t>
+            </w:r>
+            <w:proofErr w:type="spellEnd"/>
           </w:p>
         </w:tc>
         <w:tc>
@@ -11027,6 +11216,14 @@
             <w:pPr>
               <w:spacing w:after="120"/>
             </w:pPr>
+            <w:r>
+              <w:t xml:space="preserve">Admin, </w:t>
+            </w:r>
+            <w:proofErr w:type="spellStart"/>
+            <w:r>
+              <w:t>Kasir</w:t>
+            </w:r>
+            <w:proofErr w:type="spellEnd"/>
           </w:p>
         </w:tc>
       </w:tr>
@@ -11085,6 +11282,19 @@
             <w:pPr>
               <w:spacing w:after="120"/>
             </w:pPr>
+            <w:proofErr w:type="spellStart"/>
+            <w:r>
+              <w:t>Melakukan</w:t>
+            </w:r>
+            <w:proofErr w:type="spellEnd"/>
+            <w:r>
+              <w:t xml:space="preserve"> </w:t>
+            </w:r>
+            <w:proofErr w:type="spellStart"/>
+            <w:r>
+              <w:t>Transaksi</w:t>
+            </w:r>
+            <w:proofErr w:type="spellEnd"/>
           </w:p>
         </w:tc>
         <w:tc>
@@ -11108,6 +11318,11 @@
             <w:pPr>
               <w:spacing w:after="120"/>
             </w:pPr>
+            <w:proofErr w:type="spellStart"/>
+            <w:r>
+              <w:t>Kasir</w:t>
+            </w:r>
+            <w:proofErr w:type="spellEnd"/>
           </w:p>
         </w:tc>
       </w:tr>
@@ -11166,6 +11381,9 @@
             <w:pPr>
               <w:spacing w:after="120"/>
             </w:pPr>
+            <w:r>
+              <w:t>Monitoring Data</w:t>
+            </w:r>
           </w:p>
         </w:tc>
         <w:tc>
@@ -11189,6 +11407,11 @@
             <w:pPr>
               <w:spacing w:after="120"/>
             </w:pPr>
+            <w:proofErr w:type="spellStart"/>
+            <w:r>
+              <w:t>Manajer</w:t>
+            </w:r>
+            <w:proofErr w:type="spellEnd"/>
           </w:p>
         </w:tc>
       </w:tr>
@@ -11252,103 +11475,54 @@
           </w:tcPr>
           <w:p>
             <w:pPr>
-              <w:spacing w:before="400" w:after="60"/>
-              <w:jc w:val="center"/>
-            </w:pPr>
-            <w:r>
-              <w:rPr>
-                <w:b/>
-                <w:bCs/>
-              </w:rPr>
-              <w:t>[</w:t>
-            </w:r>
-            <w:proofErr w:type="spellStart"/>
-            <w:r>
-              <w:rPr>
-                <w:b/>
-                <w:bCs/>
-              </w:rPr>
-              <w:t>Tempatkan</w:t>
-            </w:r>
-            <w:proofErr w:type="spellEnd"/>
-            <w:r>
-              <w:rPr>
-                <w:b/>
-                <w:bCs/>
-              </w:rPr>
-              <w:t xml:space="preserve"> Use Case Diagram di </w:t>
-            </w:r>
-            <w:proofErr w:type="spellStart"/>
-            <w:r>
-              <w:rPr>
-                <w:b/>
-                <w:bCs/>
-              </w:rPr>
-              <w:t>sini</w:t>
-            </w:r>
-            <w:proofErr w:type="spellEnd"/>
-            <w:r>
-              <w:rPr>
-                <w:b/>
-                <w:bCs/>
-              </w:rPr>
-              <w:t>]</w:t>
-            </w:r>
-          </w:p>
-          <w:p>
-            <w:pPr>
-              <w:spacing w:after="120"/>
-            </w:pPr>
-          </w:p>
-          <w:p>
-            <w:pPr>
-              <w:spacing w:after="120"/>
-            </w:pPr>
-          </w:p>
-          <w:p>
-            <w:pPr>
-              <w:spacing w:after="120"/>
-            </w:pPr>
-          </w:p>
-          <w:p>
-            <w:pPr>
-              <w:spacing w:after="120"/>
-            </w:pPr>
-          </w:p>
-          <w:p>
-            <w:pPr>
-              <w:spacing w:after="120"/>
-            </w:pPr>
-          </w:p>
-          <w:p>
-            <w:pPr>
-              <w:spacing w:after="120"/>
-            </w:pPr>
-          </w:p>
-          <w:p>
-            <w:pPr>
-              <w:spacing w:after="120"/>
-            </w:pPr>
-          </w:p>
-          <w:p>
-            <w:pPr>
-              <w:spacing w:after="120"/>
-            </w:pPr>
-          </w:p>
-          <w:p>
-            <w:pPr>
-              <w:spacing w:after="120"/>
-            </w:pPr>
-          </w:p>
-          <w:p>
-            <w:pPr>
-              <w:spacing w:after="120"/>
-            </w:pPr>
-          </w:p>
-          <w:p>
-            <w:pPr>
-              <w:spacing w:after="120"/>
-            </w:pPr>
+              <w:spacing w:after="120"/>
+            </w:pPr>
+            <w:r>
+              <w:rPr>
+                <w:noProof/>
+              </w:rPr>
+              <w:drawing>
+                <wp:inline distT="0" distB="0" distL="0" distR="0" wp14:anchorId="19FFF5C6" wp14:editId="14D6BB28">
+                  <wp:extent cx="5562600" cy="5083721"/>
+                  <wp:effectExtent l="0" t="0" r="0" b="3175"/>
+                  <wp:docPr id="1" name="Picture 1" descr="A diagram of a business management system&#10;&#10;AI-generated content may be incorrect."/>
+                  <wp:cNvGraphicFramePr>
+                    <a:graphicFrameLocks xmlns:a="http://schemas.openxmlformats.org/drawingml/2006/main" noChangeAspect="1"/>
+                  </wp:cNvGraphicFramePr>
+                  <a:graphic xmlns:a="http://schemas.openxmlformats.org/drawingml/2006/main">
+                    <a:graphicData uri="http://schemas.openxmlformats.org/drawingml/2006/picture">
+                      <pic:pic xmlns:pic="http://schemas.openxmlformats.org/drawingml/2006/picture">
+                        <pic:nvPicPr>
+                          <pic:cNvPr id="1" name="Picture 1" descr="A diagram of a business management system&#10;&#10;AI-generated content may be incorrect."/>
+                          <pic:cNvPicPr/>
+                        </pic:nvPicPr>
+                        <pic:blipFill>
+                          <a:blip r:embed="rId7">
+                            <a:extLst>
+                              <a:ext uri="{28A0092B-C50C-407E-A947-70E740481C1C}">
+                                <a14:useLocalDpi xmlns:a14="http://schemas.microsoft.com/office/drawing/2010/main" val="0"/>
+                              </a:ext>
+                            </a:extLst>
+                          </a:blip>
+                          <a:stretch>
+                            <a:fillRect/>
+                          </a:stretch>
+                        </pic:blipFill>
+                        <pic:spPr>
+                          <a:xfrm>
+                            <a:off x="0" y="0"/>
+                            <a:ext cx="5577984" cy="5097781"/>
+                          </a:xfrm>
+                          <a:prstGeom prst="rect">
+                            <a:avLst/>
+                          </a:prstGeom>
+                        </pic:spPr>
+                      </pic:pic>
+                    </a:graphicData>
+                  </a:graphic>
+                </wp:inline>
+              </w:drawing>
+            </w:r>
           </w:p>
         </w:tc>
       </w:tr>
@@ -11554,6 +11728,9 @@
             <w:pPr>
               <w:spacing w:after="120"/>
             </w:pPr>
+            <w:r>
+              <w:t>Login</w:t>
+            </w:r>
           </w:p>
         </w:tc>
         <w:tc>
@@ -11577,6 +11754,121 @@
             <w:pPr>
               <w:spacing w:after="120"/>
             </w:pPr>
+            <w:proofErr w:type="spellStart"/>
+            <w:r>
+              <w:t>P</w:t>
+            </w:r>
+            <w:r>
+              <w:t>engguna</w:t>
+            </w:r>
+            <w:proofErr w:type="spellEnd"/>
+            <w:r>
+              <w:t xml:space="preserve"> </w:t>
+            </w:r>
+            <w:proofErr w:type="spellStart"/>
+            <w:r>
+              <w:t>memasukkan</w:t>
+            </w:r>
+            <w:proofErr w:type="spellEnd"/>
+            <w:r>
+              <w:t xml:space="preserve"> username dan password </w:t>
+            </w:r>
+            <w:proofErr w:type="spellStart"/>
+            <w:r>
+              <w:t>untuk</w:t>
+            </w:r>
+            <w:proofErr w:type="spellEnd"/>
+            <w:r>
+              <w:t xml:space="preserve"> </w:t>
+            </w:r>
+            <w:proofErr w:type="spellStart"/>
+            <w:r>
+              <w:t>masuk</w:t>
+            </w:r>
+            <w:proofErr w:type="spellEnd"/>
+            <w:r>
+              <w:t xml:space="preserve"> </w:t>
+            </w:r>
+            <w:proofErr w:type="spellStart"/>
+            <w:r>
+              <w:t>ke</w:t>
+            </w:r>
+            <w:proofErr w:type="spellEnd"/>
+            <w:r>
+              <w:t xml:space="preserve"> </w:t>
+            </w:r>
+            <w:proofErr w:type="spellStart"/>
+            <w:r>
+              <w:t>dalam</w:t>
+            </w:r>
+            <w:proofErr w:type="spellEnd"/>
+            <w:r>
+              <w:t xml:space="preserve"> </w:t>
+            </w:r>
+            <w:proofErr w:type="spellStart"/>
+            <w:r>
+              <w:t>sistem</w:t>
+            </w:r>
+            <w:proofErr w:type="spellEnd"/>
+            <w:r>
+              <w:t xml:space="preserve">. </w:t>
+            </w:r>
+            <w:proofErr w:type="spellStart"/>
+            <w:r>
+              <w:t>Sistem</w:t>
+            </w:r>
+            <w:proofErr w:type="spellEnd"/>
+            <w:r>
+              <w:t xml:space="preserve"> </w:t>
+            </w:r>
+            <w:proofErr w:type="spellStart"/>
+            <w:r>
+              <w:t>memvalidasi</w:t>
+            </w:r>
+            <w:proofErr w:type="spellEnd"/>
+            <w:r>
+              <w:t xml:space="preserve"> data dan </w:t>
+            </w:r>
+            <w:proofErr w:type="spellStart"/>
+            <w:r>
+              <w:t>memberikan</w:t>
+            </w:r>
+            <w:proofErr w:type="spellEnd"/>
+            <w:r>
+              <w:t xml:space="preserve"> </w:t>
+            </w:r>
+            <w:proofErr w:type="spellStart"/>
+            <w:r>
+              <w:t>akses</w:t>
+            </w:r>
+            <w:proofErr w:type="spellEnd"/>
+            <w:r>
+              <w:t xml:space="preserve"> </w:t>
+            </w:r>
+            <w:proofErr w:type="spellStart"/>
+            <w:r>
+              <w:t>sesuai</w:t>
+            </w:r>
+            <w:proofErr w:type="spellEnd"/>
+            <w:r>
+              <w:t xml:space="preserve"> </w:t>
+            </w:r>
+            <w:proofErr w:type="spellStart"/>
+            <w:r>
+              <w:t>dengan</w:t>
+            </w:r>
+            <w:proofErr w:type="spellEnd"/>
+            <w:r>
+              <w:t xml:space="preserve"> role </w:t>
+            </w:r>
+            <w:proofErr w:type="spellStart"/>
+            <w:r>
+              <w:t>pengguna</w:t>
+            </w:r>
+            <w:proofErr w:type="spellEnd"/>
+            <w:r>
+              <w:t>.</w:t>
+            </w:r>
           </w:p>
         </w:tc>
       </w:tr>
@@ -11635,6 +11927,14 @@
             <w:pPr>
               <w:spacing w:after="120"/>
             </w:pPr>
+            <w:r>
+              <w:t xml:space="preserve">Kelola </w:t>
+            </w:r>
+            <w:proofErr w:type="spellStart"/>
+            <w:r>
+              <w:t>Produk</w:t>
+            </w:r>
+            <w:proofErr w:type="spellEnd"/>
           </w:p>
         </w:tc>
         <w:tc>
@@ -11658,6 +11958,84 @@
             <w:pPr>
               <w:spacing w:after="120"/>
             </w:pPr>
+            <w:r>
+              <w:t xml:space="preserve">Admin </w:t>
+            </w:r>
+            <w:proofErr w:type="spellStart"/>
+            <w:r>
+              <w:t>dapat</w:t>
+            </w:r>
+            <w:proofErr w:type="spellEnd"/>
+            <w:r>
+              <w:t xml:space="preserve"> </w:t>
+            </w:r>
+            <w:proofErr w:type="spellStart"/>
+            <w:r>
+              <w:t>men</w:t>
+            </w:r>
+            <w:r>
+              <w:t>ambah</w:t>
+            </w:r>
+            <w:proofErr w:type="spellEnd"/>
+            <w:r>
+              <w:t xml:space="preserve">, </w:t>
+            </w:r>
+            <w:proofErr w:type="spellStart"/>
+            <w:r>
+              <w:t>melihat</w:t>
+            </w:r>
+            <w:proofErr w:type="spellEnd"/>
+            <w:r>
+              <w:t xml:space="preserve">, </w:t>
+            </w:r>
+            <w:proofErr w:type="spellStart"/>
+            <w:r>
+              <w:t>mengubah</w:t>
+            </w:r>
+            <w:proofErr w:type="spellEnd"/>
+            <w:r>
+              <w:t xml:space="preserve">, dan </w:t>
+            </w:r>
+            <w:proofErr w:type="spellStart"/>
+            <w:r>
+              <w:t>menghapus</w:t>
+            </w:r>
+            <w:proofErr w:type="spellEnd"/>
+            <w:r>
+              <w:t xml:space="preserve"> data </w:t>
+            </w:r>
+            <w:proofErr w:type="spellStart"/>
+            <w:r>
+              <w:t>produk</w:t>
+            </w:r>
+            <w:proofErr w:type="spellEnd"/>
+            <w:r>
+              <w:t xml:space="preserve"> yang </w:t>
+            </w:r>
+            <w:proofErr w:type="spellStart"/>
+            <w:r>
+              <w:t>terdapat</w:t>
+            </w:r>
+            <w:proofErr w:type="spellEnd"/>
+            <w:r>
+              <w:t xml:space="preserve"> </w:t>
+            </w:r>
+            <w:proofErr w:type="spellStart"/>
+            <w:r>
+              <w:t>dalam</w:t>
+            </w:r>
+            <w:proofErr w:type="spellEnd"/>
+            <w:r>
+              <w:t xml:space="preserve"> </w:t>
+            </w:r>
+            <w:proofErr w:type="spellStart"/>
+            <w:r>
+              <w:t>sistem</w:t>
+            </w:r>
+            <w:proofErr w:type="spellEnd"/>
+            <w:r>
+              <w:t>.</w:t>
+            </w:r>
           </w:p>
         </w:tc>
       </w:tr>
@@ -11716,6 +12094,17 @@
             <w:pPr>
               <w:spacing w:after="120"/>
             </w:pPr>
+            <w:r>
+              <w:t xml:space="preserve">Kelola </w:t>
+            </w:r>
+            <w:proofErr w:type="spellStart"/>
+            <w:r>
+              <w:t>Pelanggan</w:t>
+            </w:r>
+            <w:proofErr w:type="spellEnd"/>
+            <w:r>
+              <w:t xml:space="preserve"> </w:t>
+            </w:r>
           </w:p>
         </w:tc>
         <w:tc>
@@ -11739,6 +12128,73 @@
             <w:pPr>
               <w:spacing w:after="120"/>
             </w:pPr>
+            <w:r>
+              <w:t xml:space="preserve">Admin dan </w:t>
+            </w:r>
+            <w:proofErr w:type="spellStart"/>
+            <w:r>
+              <w:t>Kasir</w:t>
+            </w:r>
+            <w:proofErr w:type="spellEnd"/>
+            <w:r>
+              <w:t xml:space="preserve"> </w:t>
+            </w:r>
+            <w:proofErr w:type="spellStart"/>
+            <w:r>
+              <w:t>dapat</w:t>
+            </w:r>
+            <w:proofErr w:type="spellEnd"/>
+            <w:r>
+              <w:t xml:space="preserve"> </w:t>
+            </w:r>
+            <w:proofErr w:type="spellStart"/>
+            <w:r>
+              <w:t>menambah</w:t>
+            </w:r>
+            <w:proofErr w:type="spellEnd"/>
+            <w:r>
+              <w:t xml:space="preserve">, </w:t>
+            </w:r>
+            <w:proofErr w:type="spellStart"/>
+            <w:r>
+              <w:t>melihat</w:t>
+            </w:r>
+            <w:proofErr w:type="spellEnd"/>
+            <w:r>
+              <w:t xml:space="preserve">, </w:t>
+            </w:r>
+            <w:proofErr w:type="spellStart"/>
+            <w:r>
+              <w:t>mencari</w:t>
+            </w:r>
+            <w:proofErr w:type="spellEnd"/>
+            <w:r>
+              <w:t xml:space="preserve">, </w:t>
+            </w:r>
+            <w:proofErr w:type="spellStart"/>
+            <w:r>
+              <w:t>mengubah</w:t>
+            </w:r>
+            <w:proofErr w:type="spellEnd"/>
+            <w:r>
+              <w:t xml:space="preserve">, dan </w:t>
+            </w:r>
+            <w:proofErr w:type="spellStart"/>
+            <w:r>
+              <w:t>menghapus</w:t>
+            </w:r>
+            <w:proofErr w:type="spellEnd"/>
+            <w:r>
+              <w:t xml:space="preserve"> data </w:t>
+            </w:r>
+            <w:proofErr w:type="spellStart"/>
+            <w:r>
+              <w:t>pelanggan</w:t>
+            </w:r>
+            <w:proofErr w:type="spellEnd"/>
+            <w:r>
+              <w:t>.</w:t>
+            </w:r>
           </w:p>
         </w:tc>
       </w:tr>
@@ -11797,6 +12253,19 @@
             <w:pPr>
               <w:spacing w:after="120"/>
             </w:pPr>
+            <w:proofErr w:type="spellStart"/>
+            <w:r>
+              <w:t>Melakukan</w:t>
+            </w:r>
+            <w:proofErr w:type="spellEnd"/>
+            <w:r>
+              <w:t xml:space="preserve"> </w:t>
+            </w:r>
+            <w:proofErr w:type="spellStart"/>
+            <w:r>
+              <w:t>Transaksi</w:t>
+            </w:r>
+            <w:proofErr w:type="spellEnd"/>
           </w:p>
         </w:tc>
         <w:tc>
@@ -11820,6 +12289,183 @@
             <w:pPr>
               <w:spacing w:after="120"/>
             </w:pPr>
+            <w:proofErr w:type="spellStart"/>
+            <w:r>
+              <w:t>Kasir</w:t>
+            </w:r>
+            <w:proofErr w:type="spellEnd"/>
+            <w:r>
+              <w:t xml:space="preserve"> </w:t>
+            </w:r>
+            <w:proofErr w:type="spellStart"/>
+            <w:r>
+              <w:t>dapat</w:t>
+            </w:r>
+            <w:proofErr w:type="spellEnd"/>
+            <w:r>
+              <w:t xml:space="preserve"> </w:t>
+            </w:r>
+            <w:proofErr w:type="spellStart"/>
+            <w:r>
+              <w:t>memilih</w:t>
+            </w:r>
+            <w:proofErr w:type="spellEnd"/>
+            <w:r>
+              <w:t xml:space="preserve"> </w:t>
+            </w:r>
+            <w:proofErr w:type="spellStart"/>
+            <w:r>
+              <w:t>pelanggan</w:t>
+            </w:r>
+            <w:proofErr w:type="spellEnd"/>
+            <w:r>
+              <w:t xml:space="preserve">, </w:t>
+            </w:r>
+            <w:proofErr w:type="spellStart"/>
+            <w:r>
+              <w:t>memilih</w:t>
+            </w:r>
+            <w:proofErr w:type="spellEnd"/>
+            <w:r>
+              <w:t xml:space="preserve"> </w:t>
+            </w:r>
+            <w:proofErr w:type="spellStart"/>
+            <w:r>
+              <w:t>produk</w:t>
+            </w:r>
+            <w:proofErr w:type="spellEnd"/>
+            <w:r>
+              <w:t xml:space="preserve">, </w:t>
+            </w:r>
+            <w:proofErr w:type="spellStart"/>
+            <w:r>
+              <w:t>memasukkan</w:t>
+            </w:r>
+            <w:proofErr w:type="spellEnd"/>
+            <w:r>
+              <w:t xml:space="preserve"> </w:t>
+            </w:r>
+            <w:proofErr w:type="spellStart"/>
+            <w:r>
+              <w:t>jumlah</w:t>
+            </w:r>
+            <w:proofErr w:type="spellEnd"/>
+            <w:r>
+              <w:t xml:space="preserve"> </w:t>
+            </w:r>
+            <w:proofErr w:type="spellStart"/>
+            <w:r>
+              <w:t>barang</w:t>
+            </w:r>
+            <w:proofErr w:type="spellEnd"/>
+            <w:r>
+              <w:t xml:space="preserve">, dan </w:t>
+            </w:r>
+            <w:proofErr w:type="spellStart"/>
+            <w:r>
+              <w:t>menyimpan</w:t>
+            </w:r>
+            <w:proofErr w:type="spellEnd"/>
+            <w:r>
+              <w:t xml:space="preserve"> </w:t>
+            </w:r>
+            <w:proofErr w:type="spellStart"/>
+            <w:r>
+              <w:t>transaksi</w:t>
+            </w:r>
+            <w:proofErr w:type="spellEnd"/>
+            <w:r>
+              <w:t xml:space="preserve">. </w:t>
+            </w:r>
+            <w:proofErr w:type="spellStart"/>
+            <w:r>
+              <w:lastRenderedPageBreak/>
+              <w:t>Sistem</w:t>
+            </w:r>
+            <w:proofErr w:type="spellEnd"/>
+            <w:r>
+              <w:t xml:space="preserve"> </w:t>
+            </w:r>
+            <w:proofErr w:type="spellStart"/>
+            <w:r>
+              <w:t>menghitung</w:t>
+            </w:r>
+            <w:proofErr w:type="spellEnd"/>
+            <w:r>
+              <w:t xml:space="preserve"> total </w:t>
+            </w:r>
+            <w:proofErr w:type="spellStart"/>
+            <w:r>
+              <w:t>pembayaran</w:t>
+            </w:r>
+            <w:proofErr w:type="spellEnd"/>
+            <w:r>
+              <w:t xml:space="preserve"> </w:t>
+            </w:r>
+            <w:proofErr w:type="spellStart"/>
+            <w:r>
+              <w:t>secara</w:t>
+            </w:r>
+            <w:proofErr w:type="spellEnd"/>
+            <w:r>
+              <w:t xml:space="preserve"> </w:t>
+            </w:r>
+            <w:proofErr w:type="spellStart"/>
+            <w:r>
+              <w:t>otomatis</w:t>
+            </w:r>
+            <w:proofErr w:type="spellEnd"/>
+            <w:r>
+              <w:t xml:space="preserve"> </w:t>
+            </w:r>
+            <w:proofErr w:type="spellStart"/>
+            <w:r>
+              <w:t>serta</w:t>
+            </w:r>
+            <w:proofErr w:type="spellEnd"/>
+            <w:r>
+              <w:t xml:space="preserve"> </w:t>
+            </w:r>
+            <w:proofErr w:type="spellStart"/>
+            <w:r>
+              <w:t>mengurangi</w:t>
+            </w:r>
+            <w:proofErr w:type="spellEnd"/>
+            <w:r>
+              <w:t xml:space="preserve"> </w:t>
+            </w:r>
+            <w:proofErr w:type="spellStart"/>
+            <w:r>
+              <w:t>stok</w:t>
+            </w:r>
+            <w:proofErr w:type="spellEnd"/>
+            <w:r>
+              <w:t xml:space="preserve"> </w:t>
+            </w:r>
+            <w:proofErr w:type="spellStart"/>
+            <w:r>
+              <w:t>setelah</w:t>
+            </w:r>
+            <w:proofErr w:type="spellEnd"/>
+            <w:r>
+              <w:t xml:space="preserve"> </w:t>
+            </w:r>
+            <w:proofErr w:type="spellStart"/>
+            <w:r>
+              <w:t>transaksi</w:t>
+            </w:r>
+            <w:proofErr w:type="spellEnd"/>
+            <w:r>
+              <w:t xml:space="preserve"> </w:t>
+            </w:r>
+            <w:proofErr w:type="spellStart"/>
+            <w:r>
+              <w:t>berhasil</w:t>
+            </w:r>
+            <w:proofErr w:type="spellEnd"/>
+            <w:r>
+              <w:t>.</w:t>
+            </w:r>
           </w:p>
         </w:tc>
       </w:tr>
@@ -11853,6 +12499,7 @@
               <w:jc w:val="center"/>
             </w:pPr>
             <w:r>
+              <w:lastRenderedPageBreak/>
               <w:t>5</w:t>
             </w:r>
           </w:p>
@@ -11878,6 +12525,9 @@
             <w:pPr>
               <w:spacing w:after="120"/>
             </w:pPr>
+            <w:r>
+              <w:t>Monitoring Data</w:t>
+            </w:r>
           </w:p>
         </w:tc>
         <w:tc>
@@ -11901,6 +12551,110 @@
             <w:pPr>
               <w:spacing w:after="120"/>
             </w:pPr>
+            <w:proofErr w:type="spellStart"/>
+            <w:r>
+              <w:t>Manajer</w:t>
+            </w:r>
+            <w:proofErr w:type="spellEnd"/>
+            <w:r>
+              <w:t xml:space="preserve"> </w:t>
+            </w:r>
+            <w:proofErr w:type="spellStart"/>
+            <w:r>
+              <w:t>dapat</w:t>
+            </w:r>
+            <w:proofErr w:type="spellEnd"/>
+            <w:r>
+              <w:t xml:space="preserve"> </w:t>
+            </w:r>
+            <w:proofErr w:type="spellStart"/>
+            <w:r>
+              <w:t>melihat</w:t>
+            </w:r>
+            <w:proofErr w:type="spellEnd"/>
+            <w:r>
+              <w:t xml:space="preserve"> dan </w:t>
+            </w:r>
+            <w:proofErr w:type="spellStart"/>
+            <w:r>
+              <w:t>memantau</w:t>
+            </w:r>
+            <w:proofErr w:type="spellEnd"/>
+            <w:r>
+              <w:t xml:space="preserve"> data </w:t>
+            </w:r>
+            <w:proofErr w:type="spellStart"/>
+            <w:r>
+              <w:t>penjualan</w:t>
+            </w:r>
+            <w:proofErr w:type="spellEnd"/>
+            <w:r>
+              <w:t xml:space="preserve">, </w:t>
+            </w:r>
+            <w:proofErr w:type="spellStart"/>
+            <w:r>
+              <w:t>stok</w:t>
+            </w:r>
+            <w:proofErr w:type="spellEnd"/>
+            <w:r>
+              <w:t xml:space="preserve">, dan </w:t>
+            </w:r>
+            <w:proofErr w:type="spellStart"/>
+            <w:r>
+              <w:t>riwayat</w:t>
+            </w:r>
+            <w:proofErr w:type="spellEnd"/>
+            <w:r>
+              <w:t xml:space="preserve"> </w:t>
+            </w:r>
+            <w:proofErr w:type="spellStart"/>
+            <w:r>
+              <w:t>transaksi</w:t>
+            </w:r>
+            <w:proofErr w:type="spellEnd"/>
+            <w:r>
+              <w:t xml:space="preserve"> </w:t>
+            </w:r>
+            <w:proofErr w:type="spellStart"/>
+            <w:r>
+              <w:t>sebagai</w:t>
+            </w:r>
+            <w:proofErr w:type="spellEnd"/>
+            <w:r>
+              <w:t xml:space="preserve"> </w:t>
+            </w:r>
+            <w:proofErr w:type="spellStart"/>
+            <w:r>
+              <w:t>bahan</w:t>
+            </w:r>
+            <w:proofErr w:type="spellEnd"/>
+            <w:r>
+              <w:t xml:space="preserve"> </w:t>
+            </w:r>
+            <w:proofErr w:type="spellStart"/>
+            <w:r>
+              <w:t>evaluasi</w:t>
+            </w:r>
+            <w:proofErr w:type="spellEnd"/>
+            <w:r>
+              <w:t xml:space="preserve"> </w:t>
+            </w:r>
+            <w:proofErr w:type="spellStart"/>
+            <w:r>
+              <w:t>kegiatan</w:t>
+            </w:r>
+            <w:proofErr w:type="spellEnd"/>
+            <w:r>
+              <w:t xml:space="preserve"> </w:t>
+            </w:r>
+            <w:proofErr w:type="spellStart"/>
+            <w:r>
+              <w:t>bisnis</w:t>
+            </w:r>
+            <w:proofErr w:type="spellEnd"/>
+            <w:r>
+              <w:t>.</w:t>
+            </w:r>
           </w:p>
         </w:tc>
       </w:tr>
@@ -12181,15 +12935,71 @@
               <w:spacing w:after="60"/>
             </w:pPr>
             <w:r>
-              <w:t xml:space="preserve">[Isi </w:t>
-            </w:r>
-            <w:proofErr w:type="spellStart"/>
-            <w:r>
-              <w:t>Penjelasan</w:t>
-            </w:r>
-            <w:proofErr w:type="spellEnd"/>
-            <w:r>
-              <w:t xml:space="preserve"> Alur Proses </w:t>
+              <w:t xml:space="preserve">Alur proses </w:t>
+            </w:r>
+            <w:proofErr w:type="spellStart"/>
+            <w:r>
+              <w:t>sistem</w:t>
+            </w:r>
+            <w:proofErr w:type="spellEnd"/>
+            <w:r>
+              <w:t xml:space="preserve"> VAULTLINE </w:t>
+            </w:r>
+            <w:proofErr w:type="spellStart"/>
+            <w:r>
+              <w:t>dimulai</w:t>
+            </w:r>
+            <w:proofErr w:type="spellEnd"/>
+            <w:r>
+              <w:t xml:space="preserve"> </w:t>
+            </w:r>
+            <w:proofErr w:type="spellStart"/>
+            <w:r>
+              <w:t>dari</w:t>
+            </w:r>
+            <w:proofErr w:type="spellEnd"/>
+            <w:r>
+              <w:t xml:space="preserve"> </w:t>
+            </w:r>
+            <w:proofErr w:type="spellStart"/>
+            <w:r>
+              <w:t>pengguna</w:t>
+            </w:r>
+            <w:proofErr w:type="spellEnd"/>
+            <w:r>
+              <w:t xml:space="preserve"> </w:t>
+            </w:r>
+            <w:proofErr w:type="spellStart"/>
+            <w:r>
+              <w:t>membuka</w:t>
+            </w:r>
+            <w:proofErr w:type="spellEnd"/>
+            <w:r>
+              <w:t xml:space="preserve"> </w:t>
+            </w:r>
+            <w:proofErr w:type="spellStart"/>
+            <w:r>
+              <w:t>aplikasi</w:t>
+            </w:r>
+            <w:proofErr w:type="spellEnd"/>
+            <w:r>
+              <w:t xml:space="preserve"> dan </w:t>
+            </w:r>
+            <w:proofErr w:type="spellStart"/>
+            <w:r>
+              <w:t>melakukan</w:t>
+            </w:r>
+            <w:proofErr w:type="spellEnd"/>
+            <w:r>
+              <w:t xml:space="preserve"> login </w:t>
+            </w:r>
+            <w:proofErr w:type="spellStart"/>
+            <w:r>
+              <w:t>menggunakan</w:t>
+            </w:r>
+            <w:proofErr w:type="spellEnd"/>
+            <w:r>
+              <w:t xml:space="preserve"> username dan password. </w:t>
             </w:r>
             <w:proofErr w:type="spellStart"/>
             <w:r>
@@ -12197,22 +13007,553 @@
             </w:r>
             <w:proofErr w:type="spellEnd"/>
             <w:r>
-              <w:t>]</w:t>
-            </w:r>
-          </w:p>
-          <w:p>
-            <w:pPr>
-              <w:spacing w:after="120"/>
-            </w:pPr>
-          </w:p>
-          <w:p>
-            <w:pPr>
-              <w:spacing w:after="120"/>
-            </w:pPr>
-          </w:p>
-          <w:p>
-            <w:pPr>
-              <w:spacing w:after="120"/>
+              <w:t xml:space="preserve"> </w:t>
+            </w:r>
+            <w:proofErr w:type="spellStart"/>
+            <w:r>
+              <w:t>akan</w:t>
+            </w:r>
+            <w:proofErr w:type="spellEnd"/>
+            <w:r>
+              <w:t xml:space="preserve"> </w:t>
+            </w:r>
+            <w:proofErr w:type="spellStart"/>
+            <w:r>
+              <w:t>melakukan</w:t>
+            </w:r>
+            <w:proofErr w:type="spellEnd"/>
+            <w:r>
+              <w:t xml:space="preserve"> </w:t>
+            </w:r>
+            <w:proofErr w:type="spellStart"/>
+            <w:r>
+              <w:t>validasi</w:t>
+            </w:r>
+            <w:proofErr w:type="spellEnd"/>
+            <w:r>
+              <w:t xml:space="preserve"> data login dan </w:t>
+            </w:r>
+            <w:proofErr w:type="spellStart"/>
+            <w:r>
+              <w:t>menentukan</w:t>
+            </w:r>
+            <w:proofErr w:type="spellEnd"/>
+            <w:r>
+              <w:t xml:space="preserve"> </w:t>
+            </w:r>
+            <w:proofErr w:type="spellStart"/>
+            <w:r>
+              <w:t>hak</w:t>
+            </w:r>
+            <w:proofErr w:type="spellEnd"/>
+            <w:r>
+              <w:t xml:space="preserve"> </w:t>
+            </w:r>
+            <w:proofErr w:type="spellStart"/>
+            <w:r>
+              <w:t>akses</w:t>
+            </w:r>
+            <w:proofErr w:type="spellEnd"/>
+            <w:r>
+              <w:t xml:space="preserve"> </w:t>
+            </w:r>
+            <w:proofErr w:type="spellStart"/>
+            <w:r>
+              <w:t>berdasarkan</w:t>
+            </w:r>
+            <w:proofErr w:type="spellEnd"/>
+            <w:r>
+              <w:t xml:space="preserve"> role </w:t>
+            </w:r>
+            <w:proofErr w:type="spellStart"/>
+            <w:r>
+              <w:t>pengguna</w:t>
+            </w:r>
+            <w:proofErr w:type="spellEnd"/>
+            <w:r>
+              <w:t xml:space="preserve">, </w:t>
+            </w:r>
+            <w:proofErr w:type="spellStart"/>
+            <w:r>
+              <w:t>yaitu</w:t>
+            </w:r>
+            <w:proofErr w:type="spellEnd"/>
+            <w:r>
+              <w:t xml:space="preserve"> Admin, </w:t>
+            </w:r>
+            <w:proofErr w:type="spellStart"/>
+            <w:r>
+              <w:t>Kasir</w:t>
+            </w:r>
+            <w:proofErr w:type="spellEnd"/>
+            <w:r>
+              <w:t xml:space="preserve">, </w:t>
+            </w:r>
+            <w:proofErr w:type="spellStart"/>
+            <w:r>
+              <w:t>atau</w:t>
+            </w:r>
+            <w:proofErr w:type="spellEnd"/>
+            <w:r>
+              <w:t xml:space="preserve"> </w:t>
+            </w:r>
+            <w:proofErr w:type="spellStart"/>
+            <w:r>
+              <w:t>Manajer</w:t>
+            </w:r>
+            <w:proofErr w:type="spellEnd"/>
+            <w:r>
+              <w:t>.</w:t>
+            </w:r>
+          </w:p>
+          <w:p>
+            <w:pPr>
+              <w:spacing w:after="60"/>
+            </w:pPr>
+            <w:proofErr w:type="spellStart"/>
+            <w:r>
+              <w:t>Setelah</w:t>
+            </w:r>
+            <w:proofErr w:type="spellEnd"/>
+            <w:r>
+              <w:t xml:space="preserve"> </w:t>
+            </w:r>
+            <w:proofErr w:type="spellStart"/>
+            <w:r>
+              <w:t>berhasil</w:t>
+            </w:r>
+            <w:proofErr w:type="spellEnd"/>
+            <w:r>
+              <w:t xml:space="preserve"> login, </w:t>
+            </w:r>
+            <w:proofErr w:type="spellStart"/>
+            <w:r>
+              <w:t>pengguna</w:t>
+            </w:r>
+            <w:proofErr w:type="spellEnd"/>
+            <w:r>
+              <w:t xml:space="preserve"> </w:t>
+            </w:r>
+            <w:proofErr w:type="spellStart"/>
+            <w:r>
+              <w:t>diarahkan</w:t>
+            </w:r>
+            <w:proofErr w:type="spellEnd"/>
+            <w:r>
+              <w:t xml:space="preserve"> </w:t>
+            </w:r>
+            <w:proofErr w:type="spellStart"/>
+            <w:r>
+              <w:t>ke</w:t>
+            </w:r>
+            <w:proofErr w:type="spellEnd"/>
+            <w:r>
+              <w:t xml:space="preserve"> </w:t>
+            </w:r>
+            <w:proofErr w:type="spellStart"/>
+            <w:r>
+              <w:t>halaman</w:t>
+            </w:r>
+            <w:proofErr w:type="spellEnd"/>
+            <w:r>
+              <w:t xml:space="preserve"> dashboard </w:t>
+            </w:r>
+            <w:proofErr w:type="spellStart"/>
+            <w:r>
+              <w:t>sesuai</w:t>
+            </w:r>
+            <w:proofErr w:type="spellEnd"/>
+            <w:r>
+              <w:t xml:space="preserve"> </w:t>
+            </w:r>
+            <w:proofErr w:type="spellStart"/>
+            <w:r>
+              <w:t>dengan</w:t>
+            </w:r>
+            <w:proofErr w:type="spellEnd"/>
+            <w:r>
+              <w:t xml:space="preserve"> role masing-masing. Admin </w:t>
+            </w:r>
+            <w:proofErr w:type="spellStart"/>
+            <w:r>
+              <w:t>dapat</w:t>
+            </w:r>
+            <w:proofErr w:type="spellEnd"/>
+            <w:r>
+              <w:t xml:space="preserve"> </w:t>
+            </w:r>
+            <w:proofErr w:type="spellStart"/>
+            <w:r>
+              <w:t>mengelola</w:t>
+            </w:r>
+            <w:proofErr w:type="spellEnd"/>
+            <w:r>
+              <w:t xml:space="preserve"> </w:t>
+            </w:r>
+            <w:proofErr w:type="spellStart"/>
+            <w:r>
+              <w:t>produk</w:t>
+            </w:r>
+            <w:proofErr w:type="spellEnd"/>
+            <w:r>
+              <w:t xml:space="preserve">, </w:t>
+            </w:r>
+            <w:proofErr w:type="spellStart"/>
+            <w:r>
+              <w:t>stok</w:t>
+            </w:r>
+            <w:proofErr w:type="spellEnd"/>
+            <w:r>
+              <w:t xml:space="preserve">, dan </w:t>
+            </w:r>
+            <w:proofErr w:type="spellStart"/>
+            <w:r>
+              <w:t>pelanggan</w:t>
+            </w:r>
+            <w:proofErr w:type="spellEnd"/>
+            <w:r>
+              <w:t xml:space="preserve">. </w:t>
+            </w:r>
+            <w:proofErr w:type="spellStart"/>
+            <w:r>
+              <w:t>Kasir</w:t>
+            </w:r>
+            <w:proofErr w:type="spellEnd"/>
+            <w:r>
+              <w:t xml:space="preserve"> </w:t>
+            </w:r>
+            <w:proofErr w:type="spellStart"/>
+            <w:r>
+              <w:t>dapat</w:t>
+            </w:r>
+            <w:proofErr w:type="spellEnd"/>
+            <w:r>
+              <w:t xml:space="preserve"> </w:t>
+            </w:r>
+            <w:proofErr w:type="spellStart"/>
+            <w:r>
+              <w:t>mengelola</w:t>
+            </w:r>
+            <w:proofErr w:type="spellEnd"/>
+            <w:r>
+              <w:t xml:space="preserve"> </w:t>
+            </w:r>
+            <w:proofErr w:type="spellStart"/>
+            <w:r>
+              <w:t>pelanggan</w:t>
+            </w:r>
+            <w:proofErr w:type="spellEnd"/>
+            <w:r>
+              <w:t xml:space="preserve"> dan </w:t>
+            </w:r>
+            <w:proofErr w:type="spellStart"/>
+            <w:r>
+              <w:t>melakukan</w:t>
+            </w:r>
+            <w:proofErr w:type="spellEnd"/>
+            <w:r>
+              <w:t xml:space="preserve"> </w:t>
+            </w:r>
+            <w:proofErr w:type="spellStart"/>
+            <w:r>
+              <w:t>transaksi</w:t>
+            </w:r>
+            <w:proofErr w:type="spellEnd"/>
+            <w:r>
+              <w:t xml:space="preserve"> </w:t>
+            </w:r>
+            <w:proofErr w:type="spellStart"/>
+            <w:r>
+              <w:t>penjualan</w:t>
+            </w:r>
+            <w:proofErr w:type="spellEnd"/>
+            <w:r>
+              <w:t xml:space="preserve">. </w:t>
+            </w:r>
+            <w:proofErr w:type="spellStart"/>
+            <w:r>
+              <w:t>Manajer</w:t>
+            </w:r>
+            <w:proofErr w:type="spellEnd"/>
+            <w:r>
+              <w:t xml:space="preserve"> </w:t>
+            </w:r>
+            <w:proofErr w:type="spellStart"/>
+            <w:r>
+              <w:t>dapat</w:t>
+            </w:r>
+            <w:proofErr w:type="spellEnd"/>
+            <w:r>
+              <w:t xml:space="preserve"> </w:t>
+            </w:r>
+            <w:proofErr w:type="spellStart"/>
+            <w:r>
+              <w:t>melakukan</w:t>
+            </w:r>
+            <w:proofErr w:type="spellEnd"/>
+            <w:r>
+              <w:t xml:space="preserve"> monitoring </w:t>
+            </w:r>
+            <w:proofErr w:type="spellStart"/>
+            <w:r>
+              <w:t>terhadap</w:t>
+            </w:r>
+            <w:proofErr w:type="spellEnd"/>
+            <w:r>
+              <w:t xml:space="preserve"> data </w:t>
+            </w:r>
+            <w:proofErr w:type="spellStart"/>
+            <w:r>
+              <w:t>penjualan</w:t>
+            </w:r>
+            <w:proofErr w:type="spellEnd"/>
+            <w:r>
+              <w:t xml:space="preserve">, </w:t>
+            </w:r>
+            <w:proofErr w:type="spellStart"/>
+            <w:r>
+              <w:t>stok</w:t>
+            </w:r>
+            <w:proofErr w:type="spellEnd"/>
+            <w:r>
+              <w:t xml:space="preserve">, dan </w:t>
+            </w:r>
+            <w:proofErr w:type="spellStart"/>
+            <w:r>
+              <w:t>riwayat</w:t>
+            </w:r>
+            <w:proofErr w:type="spellEnd"/>
+            <w:r>
+              <w:t xml:space="preserve"> </w:t>
+            </w:r>
+            <w:proofErr w:type="spellStart"/>
+            <w:r>
+              <w:t>transaksi</w:t>
+            </w:r>
+            <w:proofErr w:type="spellEnd"/>
+            <w:r>
+              <w:t>.</w:t>
+            </w:r>
+          </w:p>
+          <w:p>
+            <w:pPr>
+              <w:spacing w:after="60"/>
+            </w:pPr>
+            <w:r>
+              <w:t xml:space="preserve">Pada proses </w:t>
+            </w:r>
+            <w:proofErr w:type="spellStart"/>
+            <w:r>
+              <w:t>transaksi</w:t>
+            </w:r>
+            <w:proofErr w:type="spellEnd"/>
+            <w:r>
+              <w:t xml:space="preserve">, </w:t>
+            </w:r>
+            <w:proofErr w:type="spellStart"/>
+            <w:r>
+              <w:t>Kasir</w:t>
+            </w:r>
+            <w:proofErr w:type="spellEnd"/>
+            <w:r>
+              <w:t xml:space="preserve"> </w:t>
+            </w:r>
+            <w:proofErr w:type="spellStart"/>
+            <w:r>
+              <w:t>memilih</w:t>
+            </w:r>
+            <w:proofErr w:type="spellEnd"/>
+            <w:r>
+              <w:t xml:space="preserve"> </w:t>
+            </w:r>
+            <w:proofErr w:type="spellStart"/>
+            <w:r>
+              <w:t>pelanggan</w:t>
+            </w:r>
+            <w:proofErr w:type="spellEnd"/>
+            <w:r>
+              <w:t xml:space="preserve">, </w:t>
+            </w:r>
+            <w:proofErr w:type="spellStart"/>
+            <w:r>
+              <w:t>memilih</w:t>
+            </w:r>
+            <w:proofErr w:type="spellEnd"/>
+            <w:r>
+              <w:t xml:space="preserve"> </w:t>
+            </w:r>
+            <w:proofErr w:type="spellStart"/>
+            <w:r>
+              <w:t>produk</w:t>
+            </w:r>
+            <w:proofErr w:type="spellEnd"/>
+            <w:r>
+              <w:t xml:space="preserve">, </w:t>
+            </w:r>
+            <w:proofErr w:type="spellStart"/>
+            <w:r>
+              <w:t>memasukkan</w:t>
+            </w:r>
+            <w:proofErr w:type="spellEnd"/>
+            <w:r>
+              <w:t xml:space="preserve"> </w:t>
+            </w:r>
+            <w:proofErr w:type="spellStart"/>
+            <w:r>
+              <w:t>jumlah</w:t>
+            </w:r>
+            <w:proofErr w:type="spellEnd"/>
+            <w:r>
+              <w:t xml:space="preserve"> </w:t>
+            </w:r>
+            <w:proofErr w:type="spellStart"/>
+            <w:r>
+              <w:t>barang</w:t>
+            </w:r>
+            <w:proofErr w:type="spellEnd"/>
+            <w:r>
+              <w:t xml:space="preserve">, </w:t>
+            </w:r>
+            <w:proofErr w:type="spellStart"/>
+            <w:r>
+              <w:t>kemudian</w:t>
+            </w:r>
+            <w:proofErr w:type="spellEnd"/>
+            <w:r>
+              <w:t xml:space="preserve"> </w:t>
+            </w:r>
+            <w:proofErr w:type="spellStart"/>
+            <w:r>
+              <w:t>sistem</w:t>
+            </w:r>
+            <w:proofErr w:type="spellEnd"/>
+            <w:r>
+              <w:t xml:space="preserve"> </w:t>
+            </w:r>
+            <w:proofErr w:type="spellStart"/>
+            <w:r>
+              <w:t>menghitung</w:t>
+            </w:r>
+            <w:proofErr w:type="spellEnd"/>
+            <w:r>
+              <w:t xml:space="preserve"> subtotal dan total </w:t>
+            </w:r>
+            <w:proofErr w:type="spellStart"/>
+            <w:r>
+              <w:t>pembayaran</w:t>
+            </w:r>
+            <w:proofErr w:type="spellEnd"/>
+            <w:r>
+              <w:t xml:space="preserve"> </w:t>
+            </w:r>
+            <w:proofErr w:type="spellStart"/>
+            <w:r>
+              <w:t>secara</w:t>
+            </w:r>
+            <w:proofErr w:type="spellEnd"/>
+            <w:r>
+              <w:t xml:space="preserve"> </w:t>
+            </w:r>
+            <w:proofErr w:type="spellStart"/>
+            <w:r>
+              <w:t>otomatis</w:t>
+            </w:r>
+            <w:proofErr w:type="spellEnd"/>
+            <w:r>
+              <w:t xml:space="preserve">. </w:t>
+            </w:r>
+            <w:proofErr w:type="spellStart"/>
+            <w:r>
+              <w:t>Setelah</w:t>
+            </w:r>
+            <w:proofErr w:type="spellEnd"/>
+            <w:r>
+              <w:t xml:space="preserve"> </w:t>
+            </w:r>
+            <w:proofErr w:type="spellStart"/>
+            <w:r>
+              <w:t>transaksi</w:t>
+            </w:r>
+            <w:proofErr w:type="spellEnd"/>
+            <w:r>
+              <w:t xml:space="preserve"> </w:t>
+            </w:r>
+            <w:proofErr w:type="spellStart"/>
+            <w:r>
+              <w:t>disimpan</w:t>
+            </w:r>
+            <w:proofErr w:type="spellEnd"/>
+            <w:r>
+              <w:t xml:space="preserve">, </w:t>
+            </w:r>
+            <w:proofErr w:type="spellStart"/>
+            <w:r>
+              <w:t>stok</w:t>
+            </w:r>
+            <w:proofErr w:type="spellEnd"/>
+            <w:r>
+              <w:t xml:space="preserve"> </w:t>
+            </w:r>
+            <w:proofErr w:type="spellStart"/>
+            <w:r>
+              <w:t>produk</w:t>
+            </w:r>
+            <w:proofErr w:type="spellEnd"/>
+            <w:r>
+              <w:t xml:space="preserve"> </w:t>
+            </w:r>
+            <w:proofErr w:type="spellStart"/>
+            <w:r>
+              <w:t>akan</w:t>
+            </w:r>
+            <w:proofErr w:type="spellEnd"/>
+            <w:r>
+              <w:t xml:space="preserve"> </w:t>
+            </w:r>
+            <w:proofErr w:type="spellStart"/>
+            <w:r>
+              <w:t>berkurang</w:t>
+            </w:r>
+            <w:proofErr w:type="spellEnd"/>
+            <w:r>
+              <w:t xml:space="preserve"> </w:t>
+            </w:r>
+            <w:proofErr w:type="spellStart"/>
+            <w:r>
+              <w:t>sesuai</w:t>
+            </w:r>
+            <w:proofErr w:type="spellEnd"/>
+            <w:r>
+              <w:t xml:space="preserve"> </w:t>
+            </w:r>
+            <w:proofErr w:type="spellStart"/>
+            <w:r>
+              <w:t>jumlah</w:t>
+            </w:r>
+            <w:proofErr w:type="spellEnd"/>
+            <w:r>
+              <w:t xml:space="preserve"> </w:t>
+            </w:r>
+            <w:proofErr w:type="spellStart"/>
+            <w:r>
+              <w:t>barang</w:t>
+            </w:r>
+            <w:proofErr w:type="spellEnd"/>
+            <w:r>
+              <w:t xml:space="preserve"> yang </w:t>
+            </w:r>
+            <w:proofErr w:type="spellStart"/>
+            <w:r>
+              <w:t>terjual</w:t>
+            </w:r>
+            <w:proofErr w:type="spellEnd"/>
+            <w:r>
+              <w:t>.</w:t>
+            </w:r>
+          </w:p>
+          <w:p>
+            <w:pPr>
+              <w:spacing w:after="60"/>
             </w:pPr>
           </w:p>
         </w:tc>
@@ -12393,6 +13734,7 @@
       </w:pPr>
       <w:bookmarkStart w:id="18" w:name="_Toc239750186"/>
       <w:r>
+        <w:lastRenderedPageBreak/>
         <w:t xml:space="preserve">4.3 </w:t>
       </w:r>
       <w:proofErr w:type="spellStart"/>
@@ -12813,7 +14155,6 @@
               <w:jc w:val="center"/>
             </w:pPr>
             <w:r>
-              <w:lastRenderedPageBreak/>
               <w:t>4</w:t>
             </w:r>
           </w:p>
@@ -23819,8 +25160,8 @@
     </w:tbl>
     <w:p/>
     <w:sectPr>
-      <w:headerReference w:type="default" r:id="rId7"/>
-      <w:footerReference w:type="default" r:id="rId8"/>
+      <w:headerReference w:type="default" r:id="rId8"/>
+      <w:footerReference w:type="default" r:id="rId9"/>
       <w:pgSz w:w="11906" w:h="16838"/>
       <w:pgMar w:top="1417" w:right="1417" w:bottom="1417" w:left="1417" w:header="708" w:footer="708" w:gutter="0"/>
       <w:cols w:space="720"/>
@@ -24604,7 +25945,6 @@
   <w:style w:type="character" w:default="1" w:styleId="DefaultParagraphFont">
     <w:name w:val="Default Paragraph Font"/>
     <w:uiPriority w:val="1"/>
-    <w:semiHidden/>
     <w:unhideWhenUsed/>
   </w:style>
   <w:style w:type="table" w:default="1" w:styleId="TableNormal">

</xml_diff>